<commit_message>
feat: added oled code
</commit_message>
<xml_diff>
--- a/Project Proposal.docx
+++ b/Project Proposal.docx
@@ -1621,14 +1621,17 @@
         <w:jc w:val="center"/>
       </w:pPr>
       <w:r>
+        <w:rPr>
+          <w:noProof/>
+        </w:rPr>
         <w:drawing>
-          <wp:anchor distT="0" distB="0" distL="114300" distR="114300" simplePos="0" relativeHeight="251659266" behindDoc="0" locked="0" layoutInCell="1" allowOverlap="1" wp14:anchorId="1164F908" wp14:editId="418E67F4">
+          <wp:anchor distT="0" distB="0" distL="114300" distR="114300" simplePos="0" relativeHeight="251659266" behindDoc="0" locked="0" layoutInCell="1" allowOverlap="1" wp14:anchorId="1164F908" wp14:editId="0FAB47A1">
             <wp:simplePos x="0" y="0"/>
             <wp:positionH relativeFrom="margin">
-              <wp:posOffset>-238125</wp:posOffset>
+              <wp:align>center</wp:align>
             </wp:positionH>
             <wp:positionV relativeFrom="paragraph">
-              <wp:posOffset>2799715</wp:posOffset>
+              <wp:posOffset>2820187</wp:posOffset>
             </wp:positionV>
             <wp:extent cx="6209665" cy="5133975"/>
             <wp:effectExtent l="0" t="0" r="635" b="9525"/>
@@ -1689,7 +1692,7 @@
           <w:noProof/>
         </w:rPr>
         <w:drawing>
-          <wp:anchor distT="0" distB="0" distL="114300" distR="114300" simplePos="0" relativeHeight="251658242" behindDoc="0" locked="0" layoutInCell="1" allowOverlap="1" wp14:anchorId="7CF57EDB" wp14:editId="7CDFB85B">
+          <wp:anchor distT="0" distB="0" distL="114300" distR="114300" simplePos="0" relativeHeight="251658242" behindDoc="0" locked="0" layoutInCell="1" allowOverlap="1" wp14:anchorId="7CF57EDB" wp14:editId="476F5C89">
             <wp:simplePos x="0" y="0"/>
             <wp:positionH relativeFrom="margin">
               <wp:align>left</wp:align>
@@ -1769,7 +1772,6 @@
         <w:jc w:val="center"/>
       </w:pPr>
       <w:r>
-        <w:lastRenderedPageBreak/>
         <w:t>Hardware</w:t>
       </w:r>
       <w:r>
@@ -2197,7 +2199,7 @@
           <w:noProof/>
         </w:rPr>
         <w:drawing>
-          <wp:anchor distT="0" distB="0" distL="114300" distR="114300" simplePos="0" relativeHeight="251658240" behindDoc="0" locked="0" layoutInCell="1" allowOverlap="1" wp14:anchorId="016C9596" wp14:editId="3487281A">
+          <wp:anchor distT="0" distB="0" distL="114300" distR="114300" simplePos="0" relativeHeight="251658240" behindDoc="0" locked="0" layoutInCell="1" allowOverlap="1" wp14:anchorId="016C9596" wp14:editId="38E7ACFA">
             <wp:simplePos x="0" y="0"/>
             <wp:positionH relativeFrom="margin">
               <wp:align>center</wp:align>
@@ -2289,6 +2291,7 @@
         <w:jc w:val="center"/>
       </w:pPr>
       <w:r>
+        <w:lastRenderedPageBreak/>
         <w:t>Similar Projects:</w:t>
       </w:r>
     </w:p>
@@ -2308,25 +2311,7 @@
             <w:sz w:val="28"/>
             <w:szCs w:val="28"/>
           </w:rPr>
-          <w:t>DIY</w:t>
-        </w:r>
-        <w:r>
-          <w:rPr>
-            <w:rStyle w:val="Hyperlink"/>
-            <w:rFonts w:ascii="Calibri" w:hAnsi="Calibri" w:cs="Calibri"/>
-            <w:sz w:val="28"/>
-            <w:szCs w:val="28"/>
-          </w:rPr>
-          <w:t xml:space="preserve"> </w:t>
-        </w:r>
-        <w:r>
-          <w:rPr>
-            <w:rStyle w:val="Hyperlink"/>
-            <w:rFonts w:ascii="Calibri" w:hAnsi="Calibri" w:cs="Calibri"/>
-            <w:sz w:val="28"/>
-            <w:szCs w:val="28"/>
-          </w:rPr>
-          <w:t>Working E.D.I.T.H SMART GLASSES</w:t>
+          <w:t>DIY Working E.D.I.T.H SMART GLASSES</w:t>
         </w:r>
       </w:hyperlink>
     </w:p>
@@ -2346,25 +2331,7 @@
             <w:sz w:val="28"/>
             <w:szCs w:val="28"/>
           </w:rPr>
-          <w:t>Making a real life E.D.I.T.H</w:t>
-        </w:r>
-        <w:r>
-          <w:rPr>
-            <w:rStyle w:val="Hyperlink"/>
-            <w:rFonts w:ascii="Calibri" w:hAnsi="Calibri" w:cs="Calibri"/>
-            <w:sz w:val="28"/>
-            <w:szCs w:val="28"/>
-          </w:rPr>
-          <w:t xml:space="preserve"> </w:t>
-        </w:r>
-        <w:r>
-          <w:rPr>
-            <w:rStyle w:val="Hyperlink"/>
-            <w:rFonts w:ascii="Calibri" w:hAnsi="Calibri" w:cs="Calibri"/>
-            <w:sz w:val="28"/>
-            <w:szCs w:val="28"/>
-          </w:rPr>
-          <w:t>smart glasses</w:t>
+          <w:t>Making a real life E.D.I.T.H smart glasses</w:t>
         </w:r>
       </w:hyperlink>
     </w:p>
@@ -3031,6 +2998,7 @@
   <w:style w:type="character" w:default="1" w:styleId="DefaultParagraphFont">
     <w:name w:val="Default Paragraph Font"/>
     <w:uiPriority w:val="1"/>
+    <w:semiHidden/>
     <w:unhideWhenUsed/>
   </w:style>
   <w:style w:type="table" w:default="1" w:styleId="TableNormal">

</xml_diff>